<commit_message>
Final vesion of project P. S. humburger-menu doesn't work in there
</commit_message>
<xml_diff>
--- a/Документация (Пояснительная записка in there)/Записка.docx
+++ b/Документация (Пояснительная записка in there)/Записка.docx
@@ -15,14 +15,6 @@
       <w:bookmarkStart w:id="0" w:name="_Hlk27312521"/>
       <w:bookmarkEnd w:id="0"/>
       <w:bookmarkStart w:id="1" w:name="_Hlk128514464"/>
-      <w:r>
-        <w:rPr>
-          <w:rFonts w:hint="default"/>
-          <w:szCs w:val="28"/>
-          <w:lang w:val="ru-RU"/>
-        </w:rPr>
-        <w:t>-</w:t>
-      </w:r>
       <w:r>
         <w:rPr>
           <w:szCs w:val="28"/>
@@ -212,6 +204,7 @@
         <w:pStyle w:val="10"/>
         <w:spacing w:before="240" w:after="240"/>
         <w:ind w:firstLine="709"/>
+        <w:jc w:val="center"/>
         <w:rPr>
           <w:b/>
           <w:szCs w:val="28"/>
@@ -309,6 +302,8 @@
         </w:rPr>
         <w:t>Подбор ВУЗа по набранному баллу»</w:t>
       </w:r>
+      <w:bookmarkStart w:id="17" w:name="_GoBack"/>
+      <w:bookmarkEnd w:id="17"/>
     </w:p>
     <w:p>
       <w:pPr>
@@ -397,6 +392,14 @@
       </w:r>
       <w:r>
         <w:rPr>
+          <w:rFonts w:hint="default" w:ascii="Times New Roman" w:hAnsi="Times New Roman" w:eastAsia="Times New Roman" w:cs="Times New Roman"/>
+          <w:spacing w:val="-4"/>
+          <w:lang w:val="ru-RU"/>
+        </w:rPr>
+        <w:t xml:space="preserve"> </w:t>
+      </w:r>
+      <w:r>
+        <w:rPr>
           <w:rFonts w:ascii="Times New Roman" w:hAnsi="Times New Roman" w:eastAsia="Times New Roman" w:cs="Times New Roman"/>
           <w:spacing w:val="-4"/>
         </w:rPr>
@@ -723,8 +726,8 @@
         <w:spacing w:after="0"/>
         <w:ind w:firstLine="709"/>
         <w:rPr>
-          <w:szCs w:val="28"/>
-          <w:u w:val="single"/>
+          <w:sz w:val="18"/>
+          <w:szCs w:val="18"/>
         </w:rPr>
       </w:pPr>
       <w:r>
@@ -764,6 +767,118 @@
         </w:rPr>
         <w:t>А.В. Комкова</w:t>
       </w:r>
+      <w:r>
+        <w:rPr>
+          <w:rFonts w:hint="default"/>
+          <w:sz w:val="18"/>
+          <w:szCs w:val="18"/>
+          <w:lang w:val="en-US"/>
+        </w:rPr>
+        <w:tab/>
+        <w:t/>
+      </w:r>
+      <w:r>
+        <w:rPr>
+          <w:rFonts w:hint="default"/>
+          <w:sz w:val="18"/>
+          <w:szCs w:val="18"/>
+          <w:lang w:val="en-US"/>
+        </w:rPr>
+        <w:tab/>
+        <w:t/>
+      </w:r>
+      <w:r>
+        <w:rPr>
+          <w:rFonts w:hint="default"/>
+          <w:sz w:val="18"/>
+          <w:szCs w:val="18"/>
+          <w:lang w:val="en-US"/>
+        </w:rPr>
+        <w:tab/>
+        <w:t xml:space="preserve">  </w:t>
+      </w:r>
+      <w:r>
+        <w:rPr>
+          <w:rFonts w:hint="default"/>
+          <w:sz w:val="18"/>
+          <w:szCs w:val="18"/>
+          <w:lang w:val="en-US"/>
+        </w:rPr>
+        <w:tab/>
+        <w:t/>
+      </w:r>
+      <w:r>
+        <w:rPr>
+          <w:rFonts w:hint="default"/>
+          <w:sz w:val="18"/>
+          <w:szCs w:val="18"/>
+          <w:lang w:val="en-US"/>
+        </w:rPr>
+        <w:tab/>
+        <w:t/>
+      </w:r>
+      <w:r>
+        <w:rPr>
+          <w:rFonts w:hint="default"/>
+          <w:sz w:val="18"/>
+          <w:szCs w:val="18"/>
+          <w:lang w:val="en-US"/>
+        </w:rPr>
+        <w:tab/>
+        <w:t xml:space="preserve">   </w:t>
+      </w:r>
+      <w:r>
+        <w:rPr>
+          <w:sz w:val="18"/>
+          <w:szCs w:val="18"/>
+        </w:rPr>
+        <w:t xml:space="preserve">подпись   </w:t>
+      </w:r>
+      <w:r>
+        <w:rPr>
+          <w:rFonts w:hint="default"/>
+          <w:sz w:val="18"/>
+          <w:szCs w:val="18"/>
+          <w:lang w:val="en-US"/>
+        </w:rPr>
+        <w:t xml:space="preserve">  </w:t>
+      </w:r>
+      <w:r>
+        <w:rPr>
+          <w:sz w:val="18"/>
+          <w:szCs w:val="18"/>
+        </w:rPr>
+        <w:t xml:space="preserve">          дата</w:t>
+      </w:r>
+      <w:r>
+        <w:rPr>
+          <w:sz w:val="20"/>
+        </w:rPr>
+        <w:tab/>
+      </w:r>
+      <w:r>
+        <w:rPr>
+          <w:sz w:val="20"/>
+        </w:rPr>
+        <w:t xml:space="preserve">         </w:t>
+      </w:r>
+      <w:r>
+        <w:rPr>
+          <w:rFonts w:hint="default"/>
+          <w:sz w:val="20"/>
+          <w:lang w:val="en-US"/>
+        </w:rPr>
+        <w:tab/>
+        <w:t xml:space="preserve"> </w:t>
+      </w:r>
+      <w:r>
+        <w:rPr>
+          <w:sz w:val="18"/>
+          <w:szCs w:val="18"/>
+        </w:rPr>
+        <w:t>инициалы и фамилия</w:t>
+      </w:r>
+      <w:bookmarkEnd w:id="1"/>
     </w:p>
     <w:p>
       <w:pPr>
@@ -774,7 +889,69 @@
         <w:spacing w:after="0"/>
         <w:ind w:firstLine="720"/>
         <w:rPr>
-          <w:sz w:val="20"/>
+          <w:sz w:val="18"/>
+          <w:szCs w:val="18"/>
+        </w:rPr>
+      </w:pPr>
+    </w:p>
+    <w:p>
+      <w:pPr>
+        <w:pStyle w:val="10"/>
+        <w:tabs>
+          <w:tab w:val="left" w:leader="underscore" w:pos="1134"/>
+        </w:tabs>
+        <w:spacing w:after="0"/>
+        <w:ind w:firstLine="720"/>
+        <w:rPr>
+          <w:sz w:val="18"/>
+          <w:szCs w:val="18"/>
+        </w:rPr>
+      </w:pPr>
+    </w:p>
+    <w:p>
+      <w:pPr>
+        <w:pStyle w:val="10"/>
+        <w:tabs>
+          <w:tab w:val="left" w:leader="underscore" w:pos="1134"/>
+        </w:tabs>
+        <w:spacing w:after="0"/>
+        <w:ind w:firstLine="720"/>
+        <w:rPr>
+          <w:sz w:val="18"/>
+          <w:szCs w:val="18"/>
+        </w:rPr>
+      </w:pPr>
+    </w:p>
+    <w:p>
+      <w:pPr>
+        <w:pStyle w:val="10"/>
+        <w:tabs>
+          <w:tab w:val="left" w:leader="underscore" w:pos="1134"/>
+        </w:tabs>
+        <w:spacing w:after="0"/>
+        <w:ind w:firstLine="720"/>
+        <w:rPr>
+          <w:rFonts w:hint="default"/>
+          <w:sz w:val="18"/>
+          <w:szCs w:val="18"/>
+          <w:lang w:val="ru-RU"/>
+        </w:rPr>
+      </w:pPr>
+    </w:p>
+    <w:p>
+      <w:pPr>
+        <w:pStyle w:val="10"/>
+        <w:tabs>
+          <w:tab w:val="left" w:leader="underscore" w:pos="1134"/>
+        </w:tabs>
+        <w:spacing w:after="0"/>
+        <w:ind w:left="0" w:leftChars="0" w:firstLine="0" w:firstLineChars="0"/>
+        <w:jc w:val="center"/>
+        <w:rPr>
+          <w:rFonts w:hint="default"/>
+          <w:sz w:val="18"/>
+          <w:szCs w:val="18"/>
+          <w:lang w:val="ru-RU"/>
         </w:rPr>
         <w:sectPr>
           <w:footerReference r:id="rId5" w:type="first"/>
@@ -790,31 +967,13 @@
       </w:pPr>
       <w:r>
         <w:rPr>
+          <w:rFonts w:hint="default"/>
           <w:sz w:val="18"/>
           <w:szCs w:val="18"/>
-        </w:rPr>
-        <w:t>подпись                 дата</w:t>
-      </w:r>
-      <w:r>
-        <w:rPr>
-          <w:sz w:val="20"/>
-        </w:rPr>
-        <w:tab/>
-      </w:r>
-      <w:r>
-        <w:rPr>
-          <w:sz w:val="20"/>
-        </w:rPr>
-        <w:t xml:space="preserve">                  </w:t>
-      </w:r>
-      <w:r>
-        <w:rPr>
-          <w:sz w:val="18"/>
-          <w:szCs w:val="18"/>
-        </w:rPr>
-        <w:t>инициалы и фамилия</w:t>
-      </w:r>
-      <w:bookmarkEnd w:id="1"/>
+          <w:lang w:val="ru-RU"/>
+        </w:rPr>
+        <w:t>Минск 2025</w:t>
+      </w:r>
     </w:p>
     <w:p>
       <w:pPr>
@@ -2455,8 +2614,6 @@
         </w:rPr>
         <w:br w:type="page"/>
       </w:r>
-      <w:bookmarkStart w:id="17" w:name="_GoBack"/>
-      <w:bookmarkEnd w:id="17"/>
     </w:p>
     <w:p>
       <w:pPr>
@@ -6639,6 +6796,12 @@
             <w:insideH w:val="single" w:color="000000" w:sz="4" w:space="0"/>
             <w:insideV w:val="single" w:color="000000" w:sz="4" w:space="0"/>
           </w:tblBorders>
+          <w:tblCellMar>
+            <w:top w:w="0" w:type="dxa"/>
+            <w:left w:w="0" w:type="dxa"/>
+            <w:bottom w:w="0" w:type="dxa"/>
+            <w:right w:w="0" w:type="dxa"/>
+          </w:tblCellMar>
         </w:tblPrEx>
         <w:tc>
           <w:tcPr>
@@ -8272,6 +8435,12 @@
             <w:insideH w:val="single" w:color="000000" w:sz="4" w:space="0"/>
             <w:insideV w:val="single" w:color="000000" w:sz="4" w:space="0"/>
           </w:tblBorders>
+          <w:tblCellMar>
+            <w:top w:w="0" w:type="dxa"/>
+            <w:left w:w="0" w:type="dxa"/>
+            <w:bottom w:w="0" w:type="dxa"/>
+            <w:right w:w="0" w:type="dxa"/>
+          </w:tblCellMar>
         </w:tblPrEx>
         <w:tc>
           <w:tcPr>
@@ -12879,9 +13048,9 @@
           <w:lang w:val="zh-CN"/>
         </w:rPr>
       </w:pPr>
-      <w:bookmarkStart w:id="13" w:name="_Toc133826697"/>
+      <w:bookmarkStart w:id="13" w:name="_Toc104239388"/>
       <w:bookmarkStart w:id="14" w:name="_Toc134821184"/>
-      <w:bookmarkStart w:id="15" w:name="_Toc104239388"/>
+      <w:bookmarkStart w:id="15" w:name="_Toc133826697"/>
       <w:r>
         <w:rPr>
           <w:rFonts w:ascii="Times New Roman" w:hAnsi="Times New Roman" w:cs="Times New Roman"/>
@@ -14179,6 +14348,12 @@
             <w:insideH w:val="single" w:color="000000" w:sz="4" w:space="0"/>
             <w:insideV w:val="single" w:color="000000" w:sz="4" w:space="0"/>
           </w:tblBorders>
+          <w:tblCellMar>
+            <w:top w:w="0" w:type="dxa"/>
+            <w:left w:w="0" w:type="dxa"/>
+            <w:bottom w:w="0" w:type="dxa"/>
+            <w:right w:w="0" w:type="dxa"/>
+          </w:tblCellMar>
         </w:tblPrEx>
         <w:tc>
           <w:tcPr>
@@ -34699,6 +34874,7 @@
   <w:style w:type="character" w:customStyle="1" w:styleId="37">
     <w:name w:val="Обычный (Интернет) Знак"/>
     <w:link w:val="16"/>
+    <w:qFormat/>
     <w:uiPriority w:val="0"/>
     <w:rPr>
       <w:rFonts w:ascii="Times New Roman" w:hAnsi="Times New Roman" w:eastAsia="SimSun" w:cs="Times New Roman"/>

</xml_diff>